<commit_message>
Researcher: give actionable signal-based views + sample questions
Let the Researcher answer trading-advice/signal questions with a grounded,
cited view (disclaimer kept) instead of a hard refusal, and add one-tap
sample questions to the chat empty state.

Backend (Generator): drop the pre-LLM advice refusal (isAdviceRequest,
ADVICE_CUES, REFUSAL_ADVICE). The system prompt now allows a balanced,
risk-flagged recommendation that cites sources and ends with an
educational/paper-trading disclaimer. Grounding guards (empty retrieval,
no-citation) unchanged. Updated GeneratorTest, RagLiveIT, RagController doc.

Frontend (ChatPage): sample-question chips with a send() refactor, refreshed
copy, and the refusal list trimmed to the no-context phrase; index.css for
the chips.

Docs: README, STATE, RAG_CARD and prompts/04 reconciled, plus the EN/FA
guides, deck and transcript (build scripts + regenerated .docx/.pptx).

Co-Authored-By: Claude Opus 4.8 <noreply@anthropic.com>
</commit_message>
<xml_diff>
--- a/docs/guide/presentation/CryptoCopilot-DemoDay-Script.docx
+++ b/docs/guide/presentation/CryptoCopilot-DemoDay-Script.docx
@@ -1672,7 +1672,7 @@
           <w:sz w:val="25"/>
           <w:szCs w:val="25"/>
         </w:rPr>
-        <w:t xml:space="preserve">If the answer isn’t in the sources, it just says so. And it </w:t>
+        <w:t xml:space="preserve">If the answer isn’t in the sources, it just says so. And when it does give a view, it’s </w:t>
       </w:r>
       <w:r>
         <w:rPr>
@@ -1683,7 +1683,7 @@
           <w:sz w:val="25"/>
           <w:szCs w:val="25"/>
         </w:rPr>
-        <w:t>never gives trading advice</w:t>
+        <w:t>grounded in those sources and flagged as educational, not financial advice</w:t>
       </w:r>
       <w:r>
         <w:rPr>

</xml_diff>